<commit_message>
Cambio de texto inferior en el login
</commit_message>
<xml_diff>
--- a/PROPUESTA TECNOLOGICA.docx
+++ b/PROPUESTA TECNOLOGICA.docx
@@ -117,6 +117,28 @@
           <w:rFonts w:ascii="Times New Roman" w:hAnsi="Times New Roman" w:cs="Times New Roman"/>
           <w:b/>
           <w:bCs/>
+          <w:sz w:val="28"/>
+          <w:szCs w:val="28"/>
+        </w:rPr>
+      </w:pPr>
+      <w:r>
+        <w:rPr>
+          <w:rFonts w:ascii="Times New Roman" w:hAnsi="Times New Roman" w:cs="Times New Roman"/>
+          <w:b/>
+          <w:bCs/>
+          <w:sz w:val="28"/>
+          <w:szCs w:val="28"/>
+        </w:rPr>
+        <w:t>FINOM (Finanzas y Nómina Integrada)</w:t>
+      </w:r>
+    </w:p>
+    <w:p>
+      <w:pPr>
+        <w:jc w:val="center"/>
+        <w:rPr>
+          <w:rFonts w:ascii="Times New Roman" w:hAnsi="Times New Roman" w:cs="Times New Roman"/>
+          <w:b/>
+          <w:bCs/>
           <w:sz w:val="40"/>
           <w:szCs w:val="40"/>
         </w:rPr>
@@ -124,12 +146,72 @@
       <w:r>
         <w:rPr>
           <w:rFonts w:ascii="Times New Roman" w:hAnsi="Times New Roman" w:cs="Times New Roman"/>
-          <w:b/>
-          <w:bCs/>
-          <w:sz w:val="28"/>
-          <w:szCs w:val="28"/>
-        </w:rPr>
-        <w:t>FINOM (Finanzas y Nómina Integrada)</w:t>
+          <w:noProof/>
+          <w:sz w:val="32"/>
+          <w:szCs w:val="32"/>
+        </w:rPr>
+        <w:drawing>
+          <wp:anchor distT="0" distB="0" distL="114300" distR="114300" simplePos="0" relativeHeight="251659264" behindDoc="0" locked="0" layoutInCell="1" allowOverlap="1" wp14:anchorId="71AC62A7" wp14:editId="0BE9DAD3">
+            <wp:simplePos x="0" y="0"/>
+            <wp:positionH relativeFrom="margin">
+              <wp:align>center</wp:align>
+            </wp:positionH>
+            <wp:positionV relativeFrom="paragraph">
+              <wp:posOffset>119380</wp:posOffset>
+            </wp:positionV>
+            <wp:extent cx="2724150" cy="2724150"/>
+            <wp:effectExtent l="0" t="0" r="0" b="0"/>
+            <wp:wrapSquare wrapText="bothSides"/>
+            <wp:docPr id="5" name="Imagen 5"/>
+            <wp:cNvGraphicFramePr>
+              <a:graphicFrameLocks xmlns:a="http://schemas.openxmlformats.org/drawingml/2006/main" noChangeAspect="1"/>
+            </wp:cNvGraphicFramePr>
+            <a:graphic xmlns:a="http://schemas.openxmlformats.org/drawingml/2006/main">
+              <a:graphicData uri="http://schemas.openxmlformats.org/drawingml/2006/picture">
+                <pic:pic xmlns:pic="http://schemas.openxmlformats.org/drawingml/2006/picture">
+                  <pic:nvPicPr>
+                    <pic:cNvPr id="0" name="Picture 7"/>
+                    <pic:cNvPicPr>
+                      <a:picLocks noChangeAspect="1" noChangeArrowheads="1"/>
+                    </pic:cNvPicPr>
+                  </pic:nvPicPr>
+                  <pic:blipFill>
+                    <a:blip r:embed="rId5" cstate="print">
+                      <a:extLst>
+                        <a:ext uri="{28A0092B-C50C-407E-A947-70E740481C1C}">
+                          <a14:useLocalDpi xmlns:a14="http://schemas.microsoft.com/office/drawing/2010/main" val="0"/>
+                        </a:ext>
+                      </a:extLst>
+                    </a:blip>
+                    <a:srcRect/>
+                    <a:stretch>
+                      <a:fillRect/>
+                    </a:stretch>
+                  </pic:blipFill>
+                  <pic:spPr bwMode="auto">
+                    <a:xfrm>
+                      <a:off x="0" y="0"/>
+                      <a:ext cx="2724150" cy="2724150"/>
+                    </a:xfrm>
+                    <a:prstGeom prst="rect">
+                      <a:avLst/>
+                    </a:prstGeom>
+                    <a:noFill/>
+                    <a:ln>
+                      <a:noFill/>
+                    </a:ln>
+                  </pic:spPr>
+                </pic:pic>
+              </a:graphicData>
+            </a:graphic>
+            <wp14:sizeRelH relativeFrom="page">
+              <wp14:pctWidth>0</wp14:pctWidth>
+            </wp14:sizeRelH>
+            <wp14:sizeRelV relativeFrom="page">
+              <wp14:pctHeight>0</wp14:pctHeight>
+            </wp14:sizeRelV>
+          </wp:anchor>
+        </w:drawing>
       </w:r>
     </w:p>
     <w:p>
@@ -203,7 +285,10 @@
           <w:szCs w:val="28"/>
         </w:rPr>
       </w:pPr>
-      <w:r>
+    </w:p>
+    <w:p>
+      <w:pPr>
+        <w:jc w:val="center"/>
         <w:rPr>
           <w:rFonts w:ascii="Times New Roman" w:hAnsi="Times New Roman" w:cs="Times New Roman"/>
           <w:i/>
@@ -211,6 +296,27 @@
           <w:sz w:val="28"/>
           <w:szCs w:val="28"/>
         </w:rPr>
+      </w:pPr>
+    </w:p>
+    <w:p>
+      <w:pPr>
+        <w:jc w:val="center"/>
+        <w:rPr>
+          <w:rFonts w:ascii="Times New Roman" w:hAnsi="Times New Roman" w:cs="Times New Roman"/>
+          <w:i/>
+          <w:iCs/>
+          <w:sz w:val="28"/>
+          <w:szCs w:val="28"/>
+        </w:rPr>
+      </w:pPr>
+      <w:r>
+        <w:rPr>
+          <w:rFonts w:ascii="Times New Roman" w:hAnsi="Times New Roman" w:cs="Times New Roman"/>
+          <w:i/>
+          <w:iCs/>
+          <w:sz w:val="28"/>
+          <w:szCs w:val="28"/>
+        </w:rPr>
         <w:t>Ibagué - Tolima</w:t>
       </w:r>
     </w:p>
@@ -308,47 +414,21 @@
     </w:p>
     <w:p>
       <w:pPr>
-        <w:jc w:val="center"/>
-        <w:rPr>
-          <w:rFonts w:ascii="Times New Roman" w:hAnsi="Times New Roman" w:cs="Times New Roman"/>
-          <w:sz w:val="32"/>
-          <w:szCs w:val="32"/>
-        </w:rPr>
-      </w:pPr>
-    </w:p>
-    <w:p>
-      <w:pPr>
-        <w:jc w:val="center"/>
-        <w:rPr>
-          <w:rFonts w:ascii="Times New Roman" w:hAnsi="Times New Roman" w:cs="Times New Roman"/>
-          <w:sz w:val="32"/>
-          <w:szCs w:val="32"/>
-        </w:rPr>
-      </w:pPr>
-    </w:p>
-    <w:p>
-      <w:pPr>
-        <w:jc w:val="center"/>
-        <w:rPr>
-          <w:rFonts w:ascii="Times New Roman" w:hAnsi="Times New Roman" w:cs="Times New Roman"/>
-          <w:sz w:val="32"/>
-          <w:szCs w:val="32"/>
-        </w:rPr>
-      </w:pPr>
-    </w:p>
-    <w:p>
-      <w:pPr>
-        <w:rPr>
-          <w:rFonts w:ascii="Times New Roman" w:hAnsi="Times New Roman" w:cs="Times New Roman"/>
-          <w:b/>
-          <w:bCs/>
-        </w:rPr>
-      </w:pPr>
-      <w:r>
-        <w:rPr>
-          <w:rFonts w:ascii="Times New Roman" w:hAnsi="Times New Roman" w:cs="Times New Roman"/>
-          <w:b/>
-          <w:bCs/>
+        <w:rPr>
+          <w:rFonts w:ascii="Times New Roman" w:hAnsi="Times New Roman" w:cs="Times New Roman"/>
+          <w:b/>
+          <w:bCs/>
+          <w:sz w:val="24"/>
+          <w:szCs w:val="24"/>
+        </w:rPr>
+      </w:pPr>
+      <w:r>
+        <w:rPr>
+          <w:rFonts w:ascii="Times New Roman" w:hAnsi="Times New Roman" w:cs="Times New Roman"/>
+          <w:b/>
+          <w:bCs/>
+          <w:sz w:val="24"/>
+          <w:szCs w:val="24"/>
         </w:rPr>
         <w:lastRenderedPageBreak/>
         <w:t xml:space="preserve">Problemática: </w:t>
@@ -546,7 +626,23 @@
           <w:b/>
           <w:bCs/>
         </w:rPr>
-        <w:t xml:space="preserve">Devengos: </w:t>
+        <w:t>Devengos</w:t>
+      </w:r>
+      <w:r>
+        <w:rPr>
+          <w:rFonts w:ascii="Times New Roman" w:hAnsi="Times New Roman" w:cs="Times New Roman"/>
+          <w:b/>
+          <w:bCs/>
+        </w:rPr>
+        <w:t xml:space="preserve"> (Ingresos)</w:t>
+      </w:r>
+      <w:r>
+        <w:rPr>
+          <w:rFonts w:ascii="Times New Roman" w:hAnsi="Times New Roman" w:cs="Times New Roman"/>
+          <w:b/>
+          <w:bCs/>
+        </w:rPr>
+        <w:t xml:space="preserve">: </w:t>
       </w:r>
       <w:r>
         <w:rPr>
@@ -590,7 +686,23 @@
           <w:b/>
           <w:bCs/>
         </w:rPr>
-        <w:t xml:space="preserve">Deducciones: </w:t>
+        <w:t>Deducciones</w:t>
+      </w:r>
+      <w:r>
+        <w:rPr>
+          <w:rFonts w:ascii="Times New Roman" w:hAnsi="Times New Roman" w:cs="Times New Roman"/>
+          <w:b/>
+          <w:bCs/>
+        </w:rPr>
+        <w:t xml:space="preserve"> (Egresos)</w:t>
+      </w:r>
+      <w:r>
+        <w:rPr>
+          <w:rFonts w:ascii="Times New Roman" w:hAnsi="Times New Roman" w:cs="Times New Roman"/>
+          <w:b/>
+          <w:bCs/>
+        </w:rPr>
+        <w:t xml:space="preserve">: </w:t>
       </w:r>
       <w:r>
         <w:rPr>
@@ -768,7 +880,7 @@
                     </pic:cNvPicPr>
                   </pic:nvPicPr>
                   <pic:blipFill>
-                    <a:blip r:embed="rId5" cstate="print">
+                    <a:blip r:embed="rId6" cstate="print">
                       <a:extLst>
                         <a:ext uri="{28A0092B-C50C-407E-A947-70E740481C1C}">
                           <a14:useLocalDpi xmlns:a14="http://schemas.microsoft.com/office/drawing/2010/main" val="0"/>
@@ -944,17 +1056,17 @@
           <w:rFonts w:ascii="Times New Roman" w:hAnsi="Times New Roman" w:cs="Times New Roman"/>
           <w:b/>
           <w:bCs/>
-          <w:sz w:val="24"/>
-          <w:szCs w:val="24"/>
-        </w:rPr>
-      </w:pPr>
-      <w:r>
-        <w:rPr>
-          <w:rFonts w:ascii="Times New Roman" w:hAnsi="Times New Roman" w:cs="Times New Roman"/>
-          <w:b/>
-          <w:bCs/>
-          <w:sz w:val="24"/>
-          <w:szCs w:val="24"/>
+          <w:sz w:val="28"/>
+          <w:szCs w:val="28"/>
+        </w:rPr>
+      </w:pPr>
+      <w:r>
+        <w:rPr>
+          <w:rFonts w:ascii="Times New Roman" w:hAnsi="Times New Roman" w:cs="Times New Roman"/>
+          <w:b/>
+          <w:bCs/>
+          <w:sz w:val="28"/>
+          <w:szCs w:val="28"/>
         </w:rPr>
         <w:lastRenderedPageBreak/>
         <w:t xml:space="preserve">Solución: </w:t>
@@ -1121,6 +1233,324 @@
           <w:rFonts w:ascii="Times New Roman" w:hAnsi="Times New Roman" w:cs="Times New Roman"/>
         </w:rPr>
         <w:t xml:space="preserve"> de toda la plantilla con solo un par de clics, transformando un proceso que antes era tedioso y extenso en una tarea de supervisión rápida y eficiente. En esencia, la plataforma no solo organiza las finanzas, sino que actúa como un asistente digital que les devuelve a los gestores su recurso más valioso: el tiempo para enfocarse en el crecimiento estratégico de la empresa.</w:t>
+      </w:r>
+    </w:p>
+    <w:p>
+      <w:pPr>
+        <w:spacing w:before="100" w:beforeAutospacing="1" w:after="100" w:afterAutospacing="1" w:line="240" w:lineRule="auto"/>
+        <w:outlineLvl w:val="2"/>
+        <w:rPr>
+          <w:rFonts w:ascii="Times New Roman" w:eastAsia="Times New Roman" w:hAnsi="Times New Roman" w:cs="Times New Roman"/>
+          <w:b/>
+          <w:bCs/>
+          <w:sz w:val="27"/>
+          <w:szCs w:val="27"/>
+          <w:lang w:eastAsia="es-CO"/>
+        </w:rPr>
+      </w:pPr>
+      <w:r>
+        <w:rPr>
+          <w:rFonts w:ascii="Times New Roman" w:eastAsia="Times New Roman" w:hAnsi="Times New Roman" w:cs="Times New Roman"/>
+          <w:b/>
+          <w:bCs/>
+          <w:sz w:val="27"/>
+          <w:szCs w:val="27"/>
+          <w:lang w:eastAsia="es-CO"/>
+        </w:rPr>
+        <w:t>Análisis del Requerimiento</w:t>
+      </w:r>
+    </w:p>
+    <w:p>
+      <w:pPr>
+        <w:spacing w:before="100" w:beforeAutospacing="1" w:after="100" w:afterAutospacing="1" w:line="240" w:lineRule="auto"/>
+        <w:rPr>
+          <w:rFonts w:ascii="Times New Roman" w:eastAsia="Times New Roman" w:hAnsi="Times New Roman" w:cs="Times New Roman"/>
+          <w:sz w:val="24"/>
+          <w:szCs w:val="24"/>
+          <w:lang w:eastAsia="es-CO"/>
+        </w:rPr>
+      </w:pPr>
+      <w:r>
+        <w:rPr>
+          <w:rFonts w:ascii="Times New Roman" w:eastAsia="Times New Roman" w:hAnsi="Times New Roman" w:cs="Times New Roman"/>
+          <w:sz w:val="24"/>
+          <w:szCs w:val="24"/>
+          <w:lang w:eastAsia="es-CO"/>
+        </w:rPr>
+        <w:t>Aquí</w:t>
+      </w:r>
+      <w:r>
+        <w:rPr>
+          <w:rFonts w:ascii="Times New Roman" w:eastAsia="Times New Roman" w:hAnsi="Times New Roman" w:cs="Times New Roman"/>
+          <w:sz w:val="24"/>
+          <w:szCs w:val="24"/>
+          <w:lang w:eastAsia="es-CO"/>
+        </w:rPr>
+        <w:t xml:space="preserve"> están los puntos clave que estructurarán nuestro desarrollo:</w:t>
+      </w:r>
+    </w:p>
+    <w:p>
+      <w:pPr>
+        <w:numPr>
+          <w:ilvl w:val="0"/>
+          <w:numId w:val="2"/>
+        </w:numPr>
+        <w:spacing w:before="100" w:beforeAutospacing="1" w:after="100" w:afterAutospacing="1" w:line="240" w:lineRule="auto"/>
+        <w:rPr>
+          <w:rFonts w:ascii="Times New Roman" w:eastAsia="Times New Roman" w:hAnsi="Times New Roman" w:cs="Times New Roman"/>
+          <w:sz w:val="24"/>
+          <w:szCs w:val="24"/>
+          <w:lang w:eastAsia="es-CO"/>
+        </w:rPr>
+      </w:pPr>
+      <w:r>
+        <w:rPr>
+          <w:rFonts w:ascii="Times New Roman" w:eastAsia="Times New Roman" w:hAnsi="Times New Roman" w:cs="Times New Roman"/>
+          <w:b/>
+          <w:bCs/>
+          <w:sz w:val="24"/>
+          <w:szCs w:val="24"/>
+          <w:lang w:eastAsia="es-CO"/>
+        </w:rPr>
+        <w:t>Nombre del Proyecto</w:t>
+      </w:r>
+      <w:r>
+        <w:rPr>
+          <w:rFonts w:ascii="Times New Roman" w:eastAsia="Times New Roman" w:hAnsi="Times New Roman" w:cs="Times New Roman"/>
+          <w:sz w:val="24"/>
+          <w:szCs w:val="24"/>
+          <w:lang w:eastAsia="es-CO"/>
+        </w:rPr>
+        <w:t>: La plataforma se llama FINOM (Finanzas y Nómina Integrada).</w:t>
+      </w:r>
+    </w:p>
+    <w:p>
+      <w:pPr>
+        <w:numPr>
+          <w:ilvl w:val="0"/>
+          <w:numId w:val="2"/>
+        </w:numPr>
+        <w:spacing w:before="100" w:beforeAutospacing="1" w:after="100" w:afterAutospacing="1" w:line="240" w:lineRule="auto"/>
+        <w:rPr>
+          <w:rFonts w:ascii="Times New Roman" w:eastAsia="Times New Roman" w:hAnsi="Times New Roman" w:cs="Times New Roman"/>
+          <w:sz w:val="24"/>
+          <w:szCs w:val="24"/>
+          <w:lang w:eastAsia="es-CO"/>
+        </w:rPr>
+      </w:pPr>
+      <w:r>
+        <w:rPr>
+          <w:rFonts w:ascii="Times New Roman" w:eastAsia="Times New Roman" w:hAnsi="Times New Roman" w:cs="Times New Roman"/>
+          <w:b/>
+          <w:bCs/>
+          <w:sz w:val="24"/>
+          <w:szCs w:val="24"/>
+          <w:lang w:eastAsia="es-CO"/>
+        </w:rPr>
+        <w:t>Usuarios Principales</w:t>
+      </w:r>
+      <w:r>
+        <w:rPr>
+          <w:rFonts w:ascii="Times New Roman" w:eastAsia="Times New Roman" w:hAnsi="Times New Roman" w:cs="Times New Roman"/>
+          <w:sz w:val="24"/>
+          <w:szCs w:val="24"/>
+          <w:lang w:eastAsia="es-CO"/>
+        </w:rPr>
+        <w:t xml:space="preserve">: El sistema está pensado para </w:t>
+      </w:r>
+      <w:r>
+        <w:rPr>
+          <w:rFonts w:ascii="Times New Roman" w:eastAsia="Times New Roman" w:hAnsi="Times New Roman" w:cs="Times New Roman"/>
+          <w:sz w:val="24"/>
+          <w:szCs w:val="24"/>
+          <w:lang w:eastAsia="es-CO"/>
+        </w:rPr>
+        <w:t>único uso</w:t>
+      </w:r>
+      <w:r>
+        <w:rPr>
+          <w:rFonts w:ascii="Times New Roman" w:eastAsia="Times New Roman" w:hAnsi="Times New Roman" w:cs="Times New Roman"/>
+          <w:sz w:val="24"/>
+          <w:szCs w:val="24"/>
+          <w:lang w:eastAsia="es-CO"/>
+        </w:rPr>
+        <w:t xml:space="preserve"> de los trabajadores Carolina Suarez y Mauricio Castro.</w:t>
+      </w:r>
+    </w:p>
+    <w:p>
+      <w:pPr>
+        <w:numPr>
+          <w:ilvl w:val="0"/>
+          <w:numId w:val="2"/>
+        </w:numPr>
+        <w:spacing w:before="100" w:beforeAutospacing="1" w:after="100" w:afterAutospacing="1" w:line="240" w:lineRule="auto"/>
+        <w:rPr>
+          <w:rFonts w:ascii="Times New Roman" w:eastAsia="Times New Roman" w:hAnsi="Times New Roman" w:cs="Times New Roman"/>
+          <w:sz w:val="24"/>
+          <w:szCs w:val="24"/>
+          <w:lang w:eastAsia="es-CO"/>
+        </w:rPr>
+      </w:pPr>
+      <w:r>
+        <w:rPr>
+          <w:rFonts w:ascii="Times New Roman" w:eastAsia="Times New Roman" w:hAnsi="Times New Roman" w:cs="Times New Roman"/>
+          <w:b/>
+          <w:bCs/>
+          <w:sz w:val="24"/>
+          <w:szCs w:val="24"/>
+          <w:lang w:eastAsia="es-CO"/>
+        </w:rPr>
+        <w:t>Problemática</w:t>
+      </w:r>
+      <w:r>
+        <w:rPr>
+          <w:rFonts w:ascii="Times New Roman" w:eastAsia="Times New Roman" w:hAnsi="Times New Roman" w:cs="Times New Roman"/>
+          <w:sz w:val="24"/>
+          <w:szCs w:val="24"/>
+          <w:lang w:eastAsia="es-CO"/>
+        </w:rPr>
+        <w:t>: Actualmente realizan los procesos mediante Excel de manera rutinaria. Este trabajo quincenal se ha vuelto tedioso</w:t>
+      </w:r>
+      <w:r>
+        <w:rPr>
+          <w:rFonts w:ascii="Times New Roman" w:eastAsia="Times New Roman" w:hAnsi="Times New Roman" w:cs="Times New Roman"/>
+          <w:sz w:val="24"/>
+          <w:szCs w:val="24"/>
+          <w:lang w:eastAsia="es-CO"/>
+        </w:rPr>
+        <w:t xml:space="preserve"> y</w:t>
+      </w:r>
+      <w:r>
+        <w:rPr>
+          <w:rFonts w:ascii="Times New Roman" w:eastAsia="Times New Roman" w:hAnsi="Times New Roman" w:cs="Times New Roman"/>
+          <w:sz w:val="24"/>
+          <w:szCs w:val="24"/>
+          <w:lang w:eastAsia="es-CO"/>
+        </w:rPr>
+        <w:t xml:space="preserve"> agotador</w:t>
+      </w:r>
+      <w:r>
+        <w:rPr>
+          <w:rFonts w:ascii="Times New Roman" w:eastAsia="Times New Roman" w:hAnsi="Times New Roman" w:cs="Times New Roman"/>
+          <w:sz w:val="24"/>
+          <w:szCs w:val="24"/>
+          <w:lang w:eastAsia="es-CO"/>
+        </w:rPr>
+        <w:t xml:space="preserve">, </w:t>
+      </w:r>
+      <w:r>
+        <w:rPr>
+          <w:rFonts w:ascii="Times New Roman" w:eastAsia="Times New Roman" w:hAnsi="Times New Roman" w:cs="Times New Roman"/>
+          <w:sz w:val="24"/>
+          <w:szCs w:val="24"/>
+          <w:lang w:eastAsia="es-CO"/>
+        </w:rPr>
+        <w:t>quitándoles tiempo para otras responsabilidades.</w:t>
+      </w:r>
+    </w:p>
+    <w:p>
+      <w:pPr>
+        <w:numPr>
+          <w:ilvl w:val="0"/>
+          <w:numId w:val="2"/>
+        </w:numPr>
+        <w:spacing w:before="100" w:beforeAutospacing="1" w:after="100" w:afterAutospacing="1" w:line="240" w:lineRule="auto"/>
+        <w:rPr>
+          <w:rFonts w:ascii="Times New Roman" w:eastAsia="Times New Roman" w:hAnsi="Times New Roman" w:cs="Times New Roman"/>
+          <w:sz w:val="24"/>
+          <w:szCs w:val="24"/>
+          <w:lang w:eastAsia="es-CO"/>
+        </w:rPr>
+      </w:pPr>
+      <w:r>
+        <w:rPr>
+          <w:rFonts w:ascii="Times New Roman" w:eastAsia="Times New Roman" w:hAnsi="Times New Roman" w:cs="Times New Roman"/>
+          <w:b/>
+          <w:bCs/>
+          <w:sz w:val="24"/>
+          <w:szCs w:val="24"/>
+          <w:lang w:eastAsia="es-CO"/>
+        </w:rPr>
+        <w:t>Solución</w:t>
+      </w:r>
+      <w:r>
+        <w:rPr>
+          <w:rFonts w:ascii="Times New Roman" w:eastAsia="Times New Roman" w:hAnsi="Times New Roman" w:cs="Times New Roman"/>
+          <w:sz w:val="24"/>
+          <w:szCs w:val="24"/>
+          <w:lang w:eastAsia="es-CO"/>
+        </w:rPr>
+        <w:t>: Se requiere la implementación de un Software de Gestión de Nómina Automatizada (SaaS).</w:t>
+      </w:r>
+    </w:p>
+    <w:p>
+      <w:pPr>
+        <w:numPr>
+          <w:ilvl w:val="0"/>
+          <w:numId w:val="2"/>
+        </w:numPr>
+        <w:spacing w:before="100" w:beforeAutospacing="1" w:after="100" w:afterAutospacing="1" w:line="240" w:lineRule="auto"/>
+        <w:rPr>
+          <w:rFonts w:ascii="Times New Roman" w:eastAsia="Times New Roman" w:hAnsi="Times New Roman" w:cs="Times New Roman"/>
+          <w:sz w:val="24"/>
+          <w:szCs w:val="24"/>
+          <w:lang w:eastAsia="es-CO"/>
+        </w:rPr>
+      </w:pPr>
+      <w:r>
+        <w:rPr>
+          <w:rFonts w:ascii="Times New Roman" w:eastAsia="Times New Roman" w:hAnsi="Times New Roman" w:cs="Times New Roman"/>
+          <w:b/>
+          <w:bCs/>
+          <w:sz w:val="24"/>
+          <w:szCs w:val="24"/>
+          <w:lang w:eastAsia="es-CO"/>
+        </w:rPr>
+        <w:t>Características Técnicas</w:t>
+      </w:r>
+      <w:r>
+        <w:rPr>
+          <w:rFonts w:ascii="Times New Roman" w:eastAsia="Times New Roman" w:hAnsi="Times New Roman" w:cs="Times New Roman"/>
+          <w:sz w:val="24"/>
+          <w:szCs w:val="24"/>
+          <w:lang w:eastAsia="es-CO"/>
+        </w:rPr>
+        <w:t>: Debe incluir un Motor de Cálculo Inteligente para procesar devengos y deducciones, agilizando el cálculo del Líquido a percibir.</w:t>
+      </w:r>
+    </w:p>
+    <w:p>
+      <w:pPr>
+        <w:numPr>
+          <w:ilvl w:val="0"/>
+          <w:numId w:val="2"/>
+        </w:numPr>
+        <w:spacing w:before="100" w:beforeAutospacing="1" w:after="100" w:afterAutospacing="1" w:line="240" w:lineRule="auto"/>
+        <w:rPr>
+          <w:rFonts w:ascii="Times New Roman" w:eastAsia="Times New Roman" w:hAnsi="Times New Roman" w:cs="Times New Roman"/>
+          <w:sz w:val="24"/>
+          <w:szCs w:val="24"/>
+          <w:lang w:eastAsia="es-CO"/>
+        </w:rPr>
+      </w:pPr>
+      <w:r>
+        <w:rPr>
+          <w:rFonts w:ascii="Times New Roman" w:eastAsia="Times New Roman" w:hAnsi="Times New Roman" w:cs="Times New Roman"/>
+          <w:b/>
+          <w:bCs/>
+          <w:sz w:val="24"/>
+          <w:szCs w:val="24"/>
+          <w:lang w:eastAsia="es-CO"/>
+        </w:rPr>
+        <w:t>Componentes de la Interfaz</w:t>
+      </w:r>
+      <w:r>
+        <w:rPr>
+          <w:rFonts w:ascii="Times New Roman" w:eastAsia="Times New Roman" w:hAnsi="Times New Roman" w:cs="Times New Roman"/>
+          <w:sz w:val="24"/>
+          <w:szCs w:val="24"/>
+          <w:lang w:eastAsia="es-CO"/>
+        </w:rPr>
+        <w:t>: La nómina debe estructurarse en Devengos, Deducciones, Líquido a percibir (Neto), Periodo de liquidación e Información de las partes</w:t>
       </w:r>
     </w:p>
     <w:p>
@@ -1203,6 +1633,155 @@
 <file path=word/numbering.xml><?xml version="1.0" encoding="utf-8"?>
 <w:numbering xmlns:wpc="http://schemas.microsoft.com/office/word/2010/wordprocessingCanvas" xmlns:cx="http://schemas.microsoft.com/office/drawing/2014/chartex" xmlns:cx1="http://schemas.microsoft.com/office/drawing/2015/9/8/chartex" xmlns:cx2="http://schemas.microsoft.com/office/drawing/2015/10/21/chartex" xmlns:cx3="http://schemas.microsoft.com/office/drawing/2016/5/9/chartex" xmlns:cx4="http://schemas.microsoft.com/office/drawing/2016/5/10/chartex" xmlns:cx5="http://schemas.microsoft.com/office/drawing/2016/5/11/chartex" xmlns:cx6="http://schemas.microsoft.com/office/drawing/2016/5/12/chartex" xmlns:cx7="http://schemas.microsoft.com/office/drawing/2016/5/13/chartex" xmlns:cx8="http://schemas.microsoft.com/office/drawing/2016/5/14/chartex" xmlns:mc="http://schemas.openxmlformats.org/markup-compatibility/2006" xmlns:aink="http://schemas.microsoft.com/office/drawing/2016/ink" xmlns:am3d="http://schemas.microsoft.com/office/drawing/2017/model3d" xmlns:o="urn:schemas-microsoft-com:office:office" xmlns:r="http://schemas.openxmlformats.org/officeDocument/2006/relationships" xmlns:m="http://schemas.openxmlformats.org/officeDocument/2006/math" xmlns:v="urn:schemas-microsoft-com:vml" xmlns:wp14="http://schemas.microsoft.com/office/word/2010/wordprocessingDrawing" xmlns:wp="http://schemas.openxmlformats.org/drawingml/2006/wordprocessingDrawing" xmlns:w10="urn:schemas-microsoft-com:office:word" xmlns:w="http://schemas.openxmlformats.org/wordprocessingml/2006/main" xmlns:w14="http://schemas.microsoft.com/office/word/2010/wordml" xmlns:w15="http://schemas.microsoft.com/office/word/2012/wordml" xmlns:w16cex="http://schemas.microsoft.com/office/word/2018/wordml/cex" xmlns:w16cid="http://schemas.microsoft.com/office/word/2016/wordml/cid" xmlns:w16="http://schemas.microsoft.com/office/word/2018/wordml" xmlns:w16sdtdh="http://schemas.microsoft.com/office/word/2020/wordml/sdtdatahash" xmlns:w16se="http://schemas.microsoft.com/office/word/2015/wordml/symex" xmlns:wpg="http://schemas.microsoft.com/office/word/2010/wordprocessingGroup" xmlns:wpi="http://schemas.microsoft.com/office/word/2010/wordprocessingInk" xmlns:wne="http://schemas.microsoft.com/office/word/2006/wordml" xmlns:wps="http://schemas.microsoft.com/office/word/2010/wordprocessingShape" mc:Ignorable="w14 w15 w16se w16cid w16 w16cex w16sdtdh wp14">
   <w:abstractNum w:abstractNumId="0" w15:restartNumberingAfterBreak="0">
+    <w:nsid w:val="31A370D7"/>
+    <w:multiLevelType w:val="multilevel"/>
+    <w:tmpl w:val="85D0F178"/>
+    <w:lvl w:ilvl="0">
+      <w:start w:val="1"/>
+      <w:numFmt w:val="bullet"/>
+      <w:lvlText w:val=""/>
+      <w:lvlJc w:val="left"/>
+      <w:pPr>
+        <w:tabs>
+          <w:tab w:val="num" w:pos="720"/>
+        </w:tabs>
+        <w:ind w:left="720" w:hanging="360"/>
+      </w:pPr>
+      <w:rPr>
+        <w:rFonts w:ascii="Symbol" w:hAnsi="Symbol" w:hint="default"/>
+        <w:sz w:val="20"/>
+      </w:rPr>
+    </w:lvl>
+    <w:lvl w:ilvl="1" w:tentative="1">
+      <w:start w:val="1"/>
+      <w:numFmt w:val="bullet"/>
+      <w:lvlText w:val="o"/>
+      <w:lvlJc w:val="left"/>
+      <w:pPr>
+        <w:tabs>
+          <w:tab w:val="num" w:pos="1440"/>
+        </w:tabs>
+        <w:ind w:left="1440" w:hanging="360"/>
+      </w:pPr>
+      <w:rPr>
+        <w:rFonts w:ascii="Courier New" w:hAnsi="Courier New" w:hint="default"/>
+        <w:sz w:val="20"/>
+      </w:rPr>
+    </w:lvl>
+    <w:lvl w:ilvl="2" w:tentative="1">
+      <w:start w:val="1"/>
+      <w:numFmt w:val="bullet"/>
+      <w:lvlText w:val=""/>
+      <w:lvlJc w:val="left"/>
+      <w:pPr>
+        <w:tabs>
+          <w:tab w:val="num" w:pos="2160"/>
+        </w:tabs>
+        <w:ind w:left="2160" w:hanging="360"/>
+      </w:pPr>
+      <w:rPr>
+        <w:rFonts w:ascii="Wingdings" w:hAnsi="Wingdings" w:hint="default"/>
+        <w:sz w:val="20"/>
+      </w:rPr>
+    </w:lvl>
+    <w:lvl w:ilvl="3" w:tentative="1">
+      <w:start w:val="1"/>
+      <w:numFmt w:val="bullet"/>
+      <w:lvlText w:val=""/>
+      <w:lvlJc w:val="left"/>
+      <w:pPr>
+        <w:tabs>
+          <w:tab w:val="num" w:pos="2880"/>
+        </w:tabs>
+        <w:ind w:left="2880" w:hanging="360"/>
+      </w:pPr>
+      <w:rPr>
+        <w:rFonts w:ascii="Wingdings" w:hAnsi="Wingdings" w:hint="default"/>
+        <w:sz w:val="20"/>
+      </w:rPr>
+    </w:lvl>
+    <w:lvl w:ilvl="4" w:tentative="1">
+      <w:start w:val="1"/>
+      <w:numFmt w:val="bullet"/>
+      <w:lvlText w:val=""/>
+      <w:lvlJc w:val="left"/>
+      <w:pPr>
+        <w:tabs>
+          <w:tab w:val="num" w:pos="3600"/>
+        </w:tabs>
+        <w:ind w:left="3600" w:hanging="360"/>
+      </w:pPr>
+      <w:rPr>
+        <w:rFonts w:ascii="Wingdings" w:hAnsi="Wingdings" w:hint="default"/>
+        <w:sz w:val="20"/>
+      </w:rPr>
+    </w:lvl>
+    <w:lvl w:ilvl="5" w:tentative="1">
+      <w:start w:val="1"/>
+      <w:numFmt w:val="bullet"/>
+      <w:lvlText w:val=""/>
+      <w:lvlJc w:val="left"/>
+      <w:pPr>
+        <w:tabs>
+          <w:tab w:val="num" w:pos="4320"/>
+        </w:tabs>
+        <w:ind w:left="4320" w:hanging="360"/>
+      </w:pPr>
+      <w:rPr>
+        <w:rFonts w:ascii="Wingdings" w:hAnsi="Wingdings" w:hint="default"/>
+        <w:sz w:val="20"/>
+      </w:rPr>
+    </w:lvl>
+    <w:lvl w:ilvl="6" w:tentative="1">
+      <w:start w:val="1"/>
+      <w:numFmt w:val="bullet"/>
+      <w:lvlText w:val=""/>
+      <w:lvlJc w:val="left"/>
+      <w:pPr>
+        <w:tabs>
+          <w:tab w:val="num" w:pos="5040"/>
+        </w:tabs>
+        <w:ind w:left="5040" w:hanging="360"/>
+      </w:pPr>
+      <w:rPr>
+        <w:rFonts w:ascii="Wingdings" w:hAnsi="Wingdings" w:hint="default"/>
+        <w:sz w:val="20"/>
+      </w:rPr>
+    </w:lvl>
+    <w:lvl w:ilvl="7" w:tentative="1">
+      <w:start w:val="1"/>
+      <w:numFmt w:val="bullet"/>
+      <w:lvlText w:val=""/>
+      <w:lvlJc w:val="left"/>
+      <w:pPr>
+        <w:tabs>
+          <w:tab w:val="num" w:pos="5760"/>
+        </w:tabs>
+        <w:ind w:left="5760" w:hanging="360"/>
+      </w:pPr>
+      <w:rPr>
+        <w:rFonts w:ascii="Wingdings" w:hAnsi="Wingdings" w:hint="default"/>
+        <w:sz w:val="20"/>
+      </w:rPr>
+    </w:lvl>
+    <w:lvl w:ilvl="8" w:tentative="1">
+      <w:start w:val="1"/>
+      <w:numFmt w:val="bullet"/>
+      <w:lvlText w:val=""/>
+      <w:lvlJc w:val="left"/>
+      <w:pPr>
+        <w:tabs>
+          <w:tab w:val="num" w:pos="6480"/>
+        </w:tabs>
+        <w:ind w:left="6480" w:hanging="360"/>
+      </w:pPr>
+      <w:rPr>
+        <w:rFonts w:ascii="Wingdings" w:hAnsi="Wingdings" w:hint="default"/>
+        <w:sz w:val="20"/>
+      </w:rPr>
+    </w:lvl>
+  </w:abstractNum>
+  <w:abstractNum w:abstractNumId="1" w15:restartNumberingAfterBreak="0">
     <w:nsid w:val="4D311359"/>
     <w:multiLevelType w:val="hybridMultilevel"/>
     <w:tmpl w:val="09AC46D4"/>
@@ -1315,6 +1894,9 @@
     </w:lvl>
   </w:abstractNum>
   <w:num w:numId="1">
+    <w:abstractNumId w:val="1"/>
+  </w:num>
+  <w:num w:numId="2">
     <w:abstractNumId w:val="0"/>
   </w:num>
 </w:numbering>
@@ -1719,6 +2301,26 @@
     <w:name w:val="Normal"/>
     <w:qFormat/>
   </w:style>
+  <w:style w:type="paragraph" w:styleId="Ttulo3">
+    <w:name w:val="heading 3"/>
+    <w:basedOn w:val="Normal"/>
+    <w:link w:val="Ttulo3Car"/>
+    <w:uiPriority w:val="9"/>
+    <w:qFormat/>
+    <w:rsid w:val="001456B2"/>
+    <w:pPr>
+      <w:spacing w:before="100" w:beforeAutospacing="1" w:after="100" w:afterAutospacing="1" w:line="240" w:lineRule="auto"/>
+      <w:outlineLvl w:val="2"/>
+    </w:pPr>
+    <w:rPr>
+      <w:rFonts w:ascii="Times New Roman" w:eastAsia="Times New Roman" w:hAnsi="Times New Roman" w:cs="Times New Roman"/>
+      <w:b/>
+      <w:bCs/>
+      <w:sz w:val="27"/>
+      <w:szCs w:val="27"/>
+      <w:lang w:eastAsia="es-CO"/>
+    </w:rPr>
+  </w:style>
   <w:style w:type="character" w:default="1" w:styleId="Fuentedeprrafopredeter">
     <w:name w:val="Default Paragraph Font"/>
     <w:uiPriority w:val="1"/>
@@ -1756,6 +2358,98 @@
       <w:ind w:left="720"/>
       <w:contextualSpacing/>
     </w:pPr>
+  </w:style>
+  <w:style w:type="character" w:customStyle="1" w:styleId="Ttulo3Car">
+    <w:name w:val="Título 3 Car"/>
+    <w:basedOn w:val="Fuentedeprrafopredeter"/>
+    <w:link w:val="Ttulo3"/>
+    <w:uiPriority w:val="9"/>
+    <w:rsid w:val="001456B2"/>
+    <w:rPr>
+      <w:rFonts w:ascii="Times New Roman" w:eastAsia="Times New Roman" w:hAnsi="Times New Roman" w:cs="Times New Roman"/>
+      <w:b/>
+      <w:bCs/>
+      <w:sz w:val="27"/>
+      <w:szCs w:val="27"/>
+      <w:lang w:eastAsia="es-CO"/>
+    </w:rPr>
+  </w:style>
+  <w:style w:type="paragraph" w:styleId="NormalWeb">
+    <w:name w:val="Normal (Web)"/>
+    <w:basedOn w:val="Normal"/>
+    <w:uiPriority w:val="99"/>
+    <w:semiHidden/>
+    <w:unhideWhenUsed/>
+    <w:rsid w:val="001456B2"/>
+    <w:pPr>
+      <w:spacing w:before="100" w:beforeAutospacing="1" w:after="100" w:afterAutospacing="1" w:line="240" w:lineRule="auto"/>
+    </w:pPr>
+    <w:rPr>
+      <w:rFonts w:ascii="Times New Roman" w:eastAsia="Times New Roman" w:hAnsi="Times New Roman" w:cs="Times New Roman"/>
+      <w:sz w:val="24"/>
+      <w:szCs w:val="24"/>
+      <w:lang w:eastAsia="es-CO"/>
+    </w:rPr>
+  </w:style>
+  <w:style w:type="character" w:customStyle="1" w:styleId="citation-47">
+    <w:name w:val="citation-47"/>
+    <w:basedOn w:val="Fuentedeprrafopredeter"/>
+    <w:rsid w:val="001456B2"/>
+  </w:style>
+  <w:style w:type="character" w:customStyle="1" w:styleId="citation-46">
+    <w:name w:val="citation-46"/>
+    <w:basedOn w:val="Fuentedeprrafopredeter"/>
+    <w:rsid w:val="001456B2"/>
+  </w:style>
+  <w:style w:type="character" w:customStyle="1" w:styleId="citation-45">
+    <w:name w:val="citation-45"/>
+    <w:basedOn w:val="Fuentedeprrafopredeter"/>
+    <w:rsid w:val="001456B2"/>
+  </w:style>
+  <w:style w:type="character" w:customStyle="1" w:styleId="citation-44">
+    <w:name w:val="citation-44"/>
+    <w:basedOn w:val="Fuentedeprrafopredeter"/>
+    <w:rsid w:val="001456B2"/>
+  </w:style>
+  <w:style w:type="character" w:customStyle="1" w:styleId="citation-43">
+    <w:name w:val="citation-43"/>
+    <w:basedOn w:val="Fuentedeprrafopredeter"/>
+    <w:rsid w:val="001456B2"/>
+  </w:style>
+  <w:style w:type="character" w:customStyle="1" w:styleId="citation-42">
+    <w:name w:val="citation-42"/>
+    <w:basedOn w:val="Fuentedeprrafopredeter"/>
+    <w:rsid w:val="001456B2"/>
+  </w:style>
+  <w:style w:type="character" w:customStyle="1" w:styleId="citation-41">
+    <w:name w:val="citation-41"/>
+    <w:basedOn w:val="Fuentedeprrafopredeter"/>
+    <w:rsid w:val="001456B2"/>
+  </w:style>
+  <w:style w:type="character" w:customStyle="1" w:styleId="citation-40">
+    <w:name w:val="citation-40"/>
+    <w:basedOn w:val="Fuentedeprrafopredeter"/>
+    <w:rsid w:val="001456B2"/>
+  </w:style>
+  <w:style w:type="character" w:customStyle="1" w:styleId="citation-39">
+    <w:name w:val="citation-39"/>
+    <w:basedOn w:val="Fuentedeprrafopredeter"/>
+    <w:rsid w:val="001456B2"/>
+  </w:style>
+  <w:style w:type="character" w:customStyle="1" w:styleId="citation-38">
+    <w:name w:val="citation-38"/>
+    <w:basedOn w:val="Fuentedeprrafopredeter"/>
+    <w:rsid w:val="001456B2"/>
+  </w:style>
+  <w:style w:type="character" w:customStyle="1" w:styleId="citation-37">
+    <w:name w:val="citation-37"/>
+    <w:basedOn w:val="Fuentedeprrafopredeter"/>
+    <w:rsid w:val="001456B2"/>
+  </w:style>
+  <w:style w:type="character" w:customStyle="1" w:styleId="citation-36">
+    <w:name w:val="citation-36"/>
+    <w:basedOn w:val="Fuentedeprrafopredeter"/>
+    <w:rsid w:val="001456B2"/>
   </w:style>
 </w:styles>
 </file>

</xml_diff>